<commit_message>
Tweaked Word template (bold headings)
</commit_message>
<xml_diff>
--- a/word_template.docx
+++ b/word_template.docx
@@ -796,7 +796,7 @@
     <w:semiHidden/>
     <w:unhideWhenUsed/>
     <w:qFormat/>
-    <w:rsid w:val="00A86F30"/>
+    <w:rsid w:val="00E915C1"/>
     <w:pPr>
       <w:keepNext/>
       <w:keepLines/>
@@ -805,6 +805,7 @@
     </w:pPr>
     <w:rPr>
       <w:rFonts w:eastAsiaTheme="majorEastAsia" w:cstheme="majorBidi"/>
+      <w:b/>
       <w:szCs w:val="32"/>
     </w:rPr>
   </w:style>
@@ -817,7 +818,7 @@
     <w:semiHidden/>
     <w:unhideWhenUsed/>
     <w:qFormat/>
-    <w:rsid w:val="00A86F30"/>
+    <w:rsid w:val="00E915C1"/>
     <w:pPr>
       <w:keepNext/>
       <w:keepLines/>
@@ -826,6 +827,7 @@
     </w:pPr>
     <w:rPr>
       <w:rFonts w:eastAsiaTheme="majorEastAsia" w:cstheme="majorBidi"/>
+      <w:b/>
       <w:szCs w:val="28"/>
     </w:rPr>
   </w:style>
@@ -1154,9 +1156,10 @@
     <w:link w:val="Titolo2"/>
     <w:uiPriority w:val="9"/>
     <w:semiHidden/>
-    <w:rsid w:val="00A86F30"/>
+    <w:rsid w:val="00E915C1"/>
     <w:rPr>
       <w:rFonts w:ascii="Times New Roman" w:eastAsiaTheme="majorEastAsia" w:hAnsi="Times New Roman" w:cstheme="majorBidi"/>
+      <w:b/>
       <w:sz w:val="22"/>
       <w:szCs w:val="32"/>
     </w:rPr>
@@ -1167,9 +1170,10 @@
     <w:link w:val="Titolo3"/>
     <w:uiPriority w:val="9"/>
     <w:semiHidden/>
-    <w:rsid w:val="00A86F30"/>
+    <w:rsid w:val="00E915C1"/>
     <w:rPr>
       <w:rFonts w:ascii="Times New Roman" w:eastAsiaTheme="majorEastAsia" w:hAnsi="Times New Roman" w:cstheme="majorBidi"/>
+      <w:b/>
       <w:sz w:val="22"/>
       <w:szCs w:val="28"/>
     </w:rPr>

</xml_diff>